<commit_message>
Charge neighbour discovery (one HELLO per node) and the average-energy beacon of v8; re-run every result and rebuild all documents
Co-Authored-By: Claude Opus 5.5 <noreply@anthropic.com>
Claude-Session: https://claude.ai/code/session_019rZdtfEbJpAbmcB9G79J6K
</commit_message>
<xml_diff>
--- a/thesis-final/Literature_Review.docx
+++ b/thesis-final/Literature_Review.docx
@@ -1643,7 +1643,7 @@
         <w:spacing w:after="60" w:line="290"/>
       </w:pPr>
       <w:r>
-        <w:t xml:space="preserve">Unified environment: FND 634 / HND 1216 / LND 1883, PDR 99.68% — the earliest first-node death of all protocols, caused by the negotiation overhead.</w:t>
+        <w:t xml:space="preserve">Unified environment: FND 658 / HND 1197 / LND 1875, PDR 99.65% — the earliest first-node death of all protocols, caused by the negotiation overhead.</w:t>
       </w:r>
     </w:p>
     <w:p>
@@ -3601,7 +3601,7 @@
         <w:spacing w:after="60" w:line="290"/>
       </w:pPr>
       <w:r>
-        <w:t xml:space="preserve">Unified (sensing off): FND 1311 / HND 1382 / LND 1545, PDR 99.74%; improved (zone-2 rotation at 10 %): FND 1368 / HND 1385 / LND 1767, PDR 99.51%.</w:t>
+        <w:t xml:space="preserve">Unified (sensing off): FND 1277 / HND 1384 / LND 1543, PDR 99.49%; improved (zone-2 rotation at 10 %): FND 1335 / HND 1384 / LND 1766, PDR 99.62%.</w:t>
       </w:r>
     </w:p>
     <w:p>
@@ -7572,7 +7572,7 @@
                 <w:sz w:val="18"/>
                 <w:szCs w:val="18"/>
               </w:rPr>
-              <w:t xml:space="preserve">634</w:t>
+              <w:t xml:space="preserve">658</w:t>
             </w:r>
           </w:p>
         </w:tc>
@@ -7605,7 +7605,7 @@
                 <w:sz w:val="18"/>
                 <w:szCs w:val="18"/>
               </w:rPr>
-              <w:t xml:space="preserve">1216</w:t>
+              <w:t xml:space="preserve">1197</w:t>
             </w:r>
           </w:p>
         </w:tc>
@@ -7638,7 +7638,7 @@
                 <w:sz w:val="18"/>
                 <w:szCs w:val="18"/>
               </w:rPr>
-              <w:t xml:space="preserve">1883</w:t>
+              <w:t xml:space="preserve">1875</w:t>
             </w:r>
           </w:p>
         </w:tc>
@@ -7671,7 +7671,7 @@
                 <w:sz w:val="18"/>
                 <w:szCs w:val="18"/>
               </w:rPr>
-              <w:t xml:space="preserve">99.68%</w:t>
+              <w:t xml:space="preserve">99.65%</w:t>
             </w:r>
           </w:p>
         </w:tc>
@@ -8252,7 +8252,7 @@
                 <w:sz w:val="18"/>
                 <w:szCs w:val="18"/>
               </w:rPr>
-              <w:t xml:space="preserve">1368</w:t>
+              <w:t xml:space="preserve">1335</w:t>
             </w:r>
           </w:p>
         </w:tc>
@@ -8285,7 +8285,7 @@
                 <w:sz w:val="18"/>
                 <w:szCs w:val="18"/>
               </w:rPr>
-              <w:t xml:space="preserve">1385</w:t>
+              <w:t xml:space="preserve">1384</w:t>
             </w:r>
           </w:p>
         </w:tc>
@@ -8318,7 +8318,7 @@
                 <w:sz w:val="18"/>
                 <w:szCs w:val="18"/>
               </w:rPr>
-              <w:t xml:space="preserve">1767</w:t>
+              <w:t xml:space="preserve">1766</w:t>
             </w:r>
           </w:p>
         </w:tc>
@@ -8351,7 +8351,7 @@
                 <w:sz w:val="18"/>
                 <w:szCs w:val="18"/>
               </w:rPr>
-              <w:t xml:space="preserve">99.51%</w:t>
+              <w:t xml:space="preserve">99.62%</w:t>
             </w:r>
           </w:p>
         </w:tc>
@@ -8389,7 +8389,7 @@
                 <w:sz w:val="18"/>
                 <w:szCs w:val="18"/>
               </w:rPr>
-              <w:t xml:space="preserve">v8-Chain</w:t>
+              <w:t xml:space="preserve">v8</w:t>
             </w:r>
           </w:p>
         </w:tc>
@@ -8422,7 +8422,7 @@
                 <w:sz w:val="18"/>
                 <w:szCs w:val="18"/>
               </w:rPr>
-              <w:t xml:space="preserve">2501</w:t>
+              <w:t xml:space="preserve">2446</w:t>
             </w:r>
           </w:p>
         </w:tc>
@@ -8455,7 +8455,7 @@
                 <w:sz w:val="18"/>
                 <w:szCs w:val="18"/>
               </w:rPr>
-              <w:t xml:space="preserve">2589</w:t>
+              <w:t xml:space="preserve">2536</w:t>
             </w:r>
           </w:p>
         </w:tc>
@@ -8488,7 +8488,7 @@
                 <w:sz w:val="18"/>
                 <w:szCs w:val="18"/>
               </w:rPr>
-              <w:t xml:space="preserve">2631</w:t>
+              <w:t xml:space="preserve">2566</w:t>
             </w:r>
           </w:p>
         </w:tc>
@@ -8521,7 +8521,7 @@
                 <w:sz w:val="18"/>
                 <w:szCs w:val="18"/>
               </w:rPr>
-              <w:t xml:space="preserve">99.64%</w:t>
+              <w:t xml:space="preserve">99.72%</w:t>
             </w:r>
           </w:p>
         </w:tc>

</xml_diff>